<commit_message>
updated latest toyota experience
</commit_message>
<xml_diff>
--- a/MustafaSheikh_Resume.docx
+++ b/MustafaSheikh_Resume.docx
@@ -203,7 +203,7 @@
           <w:szCs w:val="22"/>
           <w:lang w:val="en-US" w:eastAsia="en-US" w:bidi="ar-SA"/>
         </w:rPr>
-        <w:t>MATLAB/Simulink, Julia, UML, LabView</w:t>
+        <w:t>MATLAB/Simulink, UML</w:t>
       </w:r>
     </w:p>
     <w:p>
@@ -251,7 +251,7 @@
           <w:szCs w:val="22"/>
           <w:lang w:val="en-US" w:eastAsia="en-US" w:bidi="ar-SA"/>
         </w:rPr>
-        <w:t xml:space="preserve"> SAFe, Git, SVN, ADAS, Five Why, 8D, Jira, HIL</w:t>
+        <w:t xml:space="preserve"> SAFe, Git, SVN, Jira, HIL</w:t>
       </w:r>
     </w:p>
     <w:p>
@@ -311,7 +311,7 @@
           <w:szCs w:val="22"/>
           <w:lang w:val="en-US" w:eastAsia="en-US" w:bidi="ar-SA"/>
         </w:rPr>
-        <w:t>General Motors</w:t>
+        <w:t>V2Soft (Contract at Toyota North America)</w:t>
       </w:r>
       <w:r>
         <w:rPr>
@@ -336,7 +336,7 @@
           <w:szCs w:val="22"/>
           <w:lang w:val="en-US" w:eastAsia="en-US" w:bidi="ar-SA"/>
         </w:rPr>
-        <w:t>Warren</w:t>
+        <w:t>Saline</w:t>
       </w:r>
       <w:r>
         <w:rPr>
@@ -382,24 +382,7 @@
           <w:shd w:fill="auto" w:val="clear"/>
           <w:lang w:val="en-US" w:eastAsia="en-US" w:bidi="ar-SA"/>
         </w:rPr>
-        <w:t>Senior Virtual Hardware Engineer</w:t>
-      </w:r>
-      <w:r>
-        <w:rPr>
-          <w:rFonts w:eastAsia="Arial" w:cs="Arial" w:ascii="Calibri" w:hAnsi="Calibri"/>
-          <w:b w:val="false"/>
-          <w:bCs w:val="false"/>
-          <w:i w:val="false"/>
-          <w:iCs w:val="false"/>
-          <w:color w:val="000000"/>
-          <w:spacing w:val="0"/>
-          <w:kern w:val="0"/>
-          <w:sz w:val="22"/>
-          <w:szCs w:val="22"/>
-          <w:shd w:fill="auto" w:val="clear"/>
-          <w:lang w:val="en-US" w:eastAsia="en-US" w:bidi="ar-SA"/>
-        </w:rPr>
-        <w:t xml:space="preserve">  </w:t>
+        <w:t>CW Smart and Functional ECU Design Engineer</w:t>
       </w:r>
       <w:r>
         <w:rPr>
@@ -408,15 +391,37 @@
           <w:bCs/>
           <w:i/>
           <w:iCs/>
-          <w:color w:val="000000"/>
+          <w:color w:val="auto"/>
           <w:spacing w:val="0"/>
           <w:kern w:val="0"/>
           <w:sz w:val="22"/>
           <w:szCs w:val="22"/>
-          <w:shd w:fill="auto" w:val="clear"/>
-          <w:lang w:val="en-US" w:eastAsia="en-US" w:bidi="ar-SA"/>
-        </w:rPr>
-        <w:t xml:space="preserve">    </w:t>
+          <w:lang w:val="en-US" w:eastAsia="en-US" w:bidi="ar-SA"/>
+        </w:rPr>
+        <w:t xml:space="preserve">         </w:t>
+        <w:tab/>
+        <w:t xml:space="preserve">                           </w:t>
+        <w:tab/>
+        <w:tab/>
+        <w:tab/>
+        <w:tab/>
+        <w:t xml:space="preserve">                  </w:t>
+      </w:r>
+      <w:r>
+        <w:rPr>
+          <w:rFonts w:eastAsia="Arial" w:cs="Arial" w:ascii="Calibri" w:hAnsi="Calibri"/>
+          <w:b w:val="false"/>
+          <w:bCs w:val="false"/>
+          <w:i w:val="false"/>
+          <w:iCs w:val="false"/>
+          <w:color w:val="auto"/>
+          <w:spacing w:val="0"/>
+          <w:kern w:val="0"/>
+          <w:sz w:val="22"/>
+          <w:szCs w:val="22"/>
+          <w:lang w:val="en-US" w:eastAsia="en-US" w:bidi="ar-SA"/>
+        </w:rPr>
+        <w:t>Nov</w:t>
       </w:r>
       <w:r>
         <w:rPr>
@@ -432,46 +437,6 @@
           <w:szCs w:val="22"/>
           <w:lang w:val="en-US" w:eastAsia="en-US" w:bidi="ar-SA"/>
         </w:rPr>
-        <w:t xml:space="preserve">         </w:t>
-        <w:tab/>
-        <w:t xml:space="preserve">                           </w:t>
-        <w:tab/>
-        <w:tab/>
-        <w:tab/>
-        <w:tab/>
-        <w:tab/>
-        <w:t xml:space="preserve">            </w:t>
-      </w:r>
-      <w:r>
-        <w:rPr>
-          <w:rFonts w:eastAsia="Arial" w:cs="Arial" w:ascii="Calibri" w:hAnsi="Calibri"/>
-          <w:b w:val="false"/>
-          <w:bCs w:val="false"/>
-          <w:i w:val="false"/>
-          <w:iCs w:val="false"/>
-          <w:color w:val="auto"/>
-          <w:spacing w:val="0"/>
-          <w:kern w:val="0"/>
-          <w:sz w:val="22"/>
-          <w:szCs w:val="22"/>
-          <w:lang w:val="en-US" w:eastAsia="en-US" w:bidi="ar-SA"/>
-        </w:rPr>
-        <w:t>Nov</w:t>
-      </w:r>
-      <w:r>
-        <w:rPr>
-          <w:rFonts w:eastAsia="Arial" w:cs="Arial" w:ascii="Calibri" w:hAnsi="Calibri"/>
-          <w:b/>
-          <w:bCs/>
-          <w:i/>
-          <w:iCs/>
-          <w:color w:val="auto"/>
-          <w:spacing w:val="0"/>
-          <w:kern w:val="0"/>
-          <w:sz w:val="22"/>
-          <w:szCs w:val="22"/>
-          <w:lang w:val="en-US" w:eastAsia="en-US" w:bidi="ar-SA"/>
-        </w:rPr>
         <w:t xml:space="preserve"> </w:t>
       </w:r>
       <w:r>
@@ -481,44 +446,26 @@
           <w:sz w:val="22"/>
           <w:szCs w:val="22"/>
         </w:rPr>
-        <w:t>2022 – Sept 2024</w:t>
-      </w:r>
-      <w:r>
-        <w:rPr>
-          <w:rFonts w:ascii="Calibri" w:hAnsi="Calibri"/>
-          <w:color w:val="000000"/>
-          <w:sz w:val="22"/>
-          <w:szCs w:val="22"/>
-          <w:shd w:fill="auto" w:val="clear"/>
-        </w:rPr>
-        <w:t xml:space="preserve">  </w:t>
-      </w:r>
-    </w:p>
-    <w:p>
-      <w:pPr>
-        <w:pStyle w:val="Normal"/>
-        <w:rPr>
-          <w:color w:val="auto"/>
-        </w:rPr>
-      </w:pPr>
-      <w:r>
-        <w:rPr>
-          <w:rFonts w:ascii="Calibri" w:hAnsi="Calibri"/>
-          <w:color w:val="000000"/>
-          <w:sz w:val="22"/>
-          <w:szCs w:val="22"/>
-          <w:shd w:fill="auto" w:val="clear"/>
-        </w:rPr>
-        <w:t>Utilized</w:t>
-      </w:r>
-      <w:r>
-        <w:rPr>
-          <w:rFonts w:ascii="Calibri" w:hAnsi="Calibri"/>
-          <w:color w:val="auto"/>
-          <w:sz w:val="22"/>
-          <w:szCs w:val="22"/>
-        </w:rPr>
-        <w:t xml:space="preserve"> hardware virtualization to accelerate delivery of software for Software-Defined Vehicle platform.</w:t>
+        <w:t>2024– Present</w:t>
+      </w:r>
+      <w:r>
+        <w:rPr>
+          <w:rFonts w:ascii="Calibri" w:hAnsi="Calibri"/>
+          <w:color w:val="000000"/>
+          <w:sz w:val="22"/>
+          <w:szCs w:val="22"/>
+          <w:shd w:fill="auto" w:val="clear"/>
+        </w:rPr>
+        <w:t xml:space="preserve">  S</w:t>
+      </w:r>
+      <w:r>
+        <w:rPr>
+          <w:rFonts w:ascii="Calibri" w:hAnsi="Calibri"/>
+          <w:color w:val="auto"/>
+          <w:sz w:val="22"/>
+          <w:szCs w:val="22"/>
+        </w:rPr>
+        <w:t>upporting Toyota’s next generation electrical architecture design efforts focusing on Body, Smart and Digital Key systems.</w:t>
       </w:r>
     </w:p>
     <w:p>
@@ -561,7 +508,7 @@
           <w:shd w:fill="auto" w:val="clear"/>
           <w:lang w:val="en-US" w:eastAsia="en-US" w:bidi="ar-SA"/>
         </w:rPr>
-        <w:t>Championed and secured organizational buy-in for $2 million Synopsys Virtualizer based 'shift-left' approach to Connectivity Module development enabling exploratory early designs.</w:t>
+        <w:t>Spearheaded competitor benchmark study for Digital Key system highlighting current trends and branding strategy for legacy plus startup OEMs. The findings were presented to senior management, influencing future product strategy.</w:t>
       </w:r>
     </w:p>
     <w:p>
@@ -605,7 +552,39 @@
           <w:shd w:fill="auto" w:val="clear"/>
           <w:lang w:val="en-US" w:eastAsia="en-US" w:bidi="ar-SA"/>
         </w:rPr>
-        <w:t xml:space="preserve">Led cross-functional development and delivery of Synopsys Virtualizer based Occupant Safety Module with test software, accelerating integration testing efforts by 4 months ahead of official software availability. </w:t>
+        <w:t>Collaborated with marketing teams to conduct a detailed technical and customer survey benchmarking Tesla’s camera-based automatic rain senso</w:t>
+      </w:r>
+      <w:r>
+        <w:rPr>
+          <w:rStyle w:val="StrongEmphasis"/>
+          <w:rFonts w:eastAsia="Arial" w:cs="Arial" w:ascii="Calibri" w:hAnsi="Calibri"/>
+          <w:b/>
+          <w:bCs w:val="false"/>
+          <w:color w:val="000000"/>
+          <w:spacing w:val="0"/>
+          <w:kern w:val="0"/>
+          <w:sz w:val="22"/>
+          <w:szCs w:val="22"/>
+          <w:shd w:fill="auto" w:val="clear"/>
+          <w:lang w:val="en-US" w:eastAsia="en-US" w:bidi="ar-SA"/>
+        </w:rPr>
+        <w:t>r</w:t>
+      </w:r>
+      <w:r>
+        <w:rPr>
+          <w:rStyle w:val="StrongEmphasis"/>
+          <w:rFonts w:eastAsia="Arial" w:cs="Arial" w:ascii="Calibri" w:hAnsi="Calibri"/>
+          <w:b w:val="false"/>
+          <w:bCs w:val="false"/>
+          <w:color w:val="000000"/>
+          <w:spacing w:val="0"/>
+          <w:kern w:val="0"/>
+          <w:sz w:val="22"/>
+          <w:szCs w:val="22"/>
+          <w:shd w:fill="auto" w:val="clear"/>
+          <w:lang w:val="en-US" w:eastAsia="en-US" w:bidi="ar-SA"/>
+        </w:rPr>
+        <w:t xml:space="preserve"> against mature technologies. The insights were presented to Toyota Japan, directly impacting engineering decisions.</w:t>
       </w:r>
     </w:p>
     <w:p>
@@ -649,7 +628,7 @@
           <w:shd w:fill="auto" w:val="clear"/>
           <w:lang w:val="en-US" w:eastAsia="en-US" w:bidi="ar-SA"/>
         </w:rPr>
-        <w:t>Successfully launched next-generation ASTC Vlab based Central Gateway Module 8 months ahead of hardware schedule, driving concept-to-release progress and facilitating early software testing and integration.</w:t>
+        <w:t>Led cost-saving initiatives for the Sienna and Grand Highlander Mirror ECUs, achieving a yearly savings of approximately $20,000.</w:t>
       </w:r>
     </w:p>
     <w:p>
@@ -669,19 +648,6 @@
           <w:rFonts w:eastAsia="Arial" w:cs="Arial" w:ascii="Calibri" w:hAnsi="Calibri"/>
           <w:b w:val="false"/>
           <w:bCs w:val="false"/>
-          <w:color w:val="auto"/>
-          <w:sz w:val="22"/>
-          <w:szCs w:val="22"/>
-          <w:lang w:val="en-US" w:eastAsia="en-US" w:bidi="ar-SA"/>
-        </w:rPr>
-        <w:t>•</w:t>
-      </w:r>
-      <w:r>
-        <w:rPr>
-          <w:rStyle w:val="StrongEmphasis"/>
-          <w:rFonts w:eastAsia="Arial" w:cs="Arial" w:ascii="Calibri" w:hAnsi="Calibri"/>
-          <w:b w:val="false"/>
-          <w:bCs w:val="false"/>
           <w:color w:val="000000"/>
           <w:spacing w:val="0"/>
           <w:kern w:val="0"/>
@@ -690,20 +656,23 @@
           <w:shd w:fill="auto" w:val="clear"/>
           <w:lang w:val="en-US" w:eastAsia="en-US" w:bidi="ar-SA"/>
         </w:rPr>
-        <w:t xml:space="preserve"> </w:t>
-      </w:r>
-      <w:r>
-        <w:rPr>
-          <w:rStyle w:val="StrongEmphasis"/>
-          <w:rFonts w:eastAsia="Arial" w:cs="Arial" w:ascii="Calibri" w:hAnsi="Calibri"/>
-          <w:b w:val="false"/>
-          <w:bCs w:val="false"/>
-          <w:color w:val="auto"/>
-          <w:sz w:val="22"/>
-          <w:szCs w:val="22"/>
-          <w:lang w:val="en-US" w:eastAsia="en-US" w:bidi="ar-SA"/>
-        </w:rPr>
-        <w:t>Leveraged expertise in virtual workflows to collaborate with product owners and release train engineers to integrate virtual hardware team into enterprise level agile framework.</w:t>
+        <w:t xml:space="preserve">• </w:t>
+      </w:r>
+      <w:r>
+        <w:rPr>
+          <w:rStyle w:val="StrongEmphasis"/>
+          <w:rFonts w:eastAsia="Arial" w:cs="Arial" w:ascii="Calibri" w:hAnsi="Calibri"/>
+          <w:b w:val="false"/>
+          <w:bCs w:val="false"/>
+          <w:color w:val="000000"/>
+          <w:spacing w:val="0"/>
+          <w:kern w:val="0"/>
+          <w:sz w:val="22"/>
+          <w:szCs w:val="22"/>
+          <w:shd w:fill="auto" w:val="clear"/>
+          <w:lang w:val="en-US" w:eastAsia="en-US" w:bidi="ar-SA"/>
+        </w:rPr>
+        <w:t>Led cyber-security audit for upcoming Grand-Highlander’s Smart and Digital Key systems representing design team while presenting results to Toyota Japan.</w:t>
       </w:r>
     </w:p>
     <w:p>
@@ -723,19 +692,6 @@
           <w:rFonts w:eastAsia="Arial" w:cs="Arial" w:ascii="Calibri" w:hAnsi="Calibri"/>
           <w:b w:val="false"/>
           <w:bCs w:val="false"/>
-          <w:color w:val="auto"/>
-          <w:sz w:val="22"/>
-          <w:szCs w:val="22"/>
-          <w:lang w:val="en-US" w:eastAsia="en-US" w:bidi="ar-SA"/>
-        </w:rPr>
-        <w:t>•</w:t>
-      </w:r>
-      <w:r>
-        <w:rPr>
-          <w:rStyle w:val="StrongEmphasis"/>
-          <w:rFonts w:eastAsia="Arial" w:cs="Arial" w:ascii="Calibri" w:hAnsi="Calibri"/>
-          <w:b w:val="false"/>
-          <w:bCs w:val="false"/>
           <w:color w:val="000000"/>
           <w:spacing w:val="0"/>
           <w:kern w:val="0"/>
@@ -744,7 +700,7 @@
           <w:shd w:fill="auto" w:val="clear"/>
           <w:lang w:val="en-US" w:eastAsia="en-US" w:bidi="ar-SA"/>
         </w:rPr>
-        <w:t xml:space="preserve"> </w:t>
+        <w:t xml:space="preserve">• </w:t>
       </w:r>
       <w:r>
         <w:rPr>
@@ -760,20 +716,7 @@
           <w:shd w:fill="auto" w:val="clear"/>
           <w:lang w:val="en-US" w:eastAsia="en-US" w:bidi="ar-SA"/>
         </w:rPr>
-        <w:t>Scrum Lead</w:t>
-      </w:r>
-      <w:r>
-        <w:rPr>
-          <w:rStyle w:val="StrongEmphasis"/>
-          <w:rFonts w:eastAsia="Arial" w:cs="Arial" w:ascii="Calibri" w:hAnsi="Calibri"/>
-          <w:b w:val="false"/>
-          <w:bCs w:val="false"/>
-          <w:color w:val="auto"/>
-          <w:sz w:val="22"/>
-          <w:szCs w:val="22"/>
-          <w:lang w:val="en-US" w:eastAsia="en-US" w:bidi="ar-SA"/>
-        </w:rPr>
-        <w:t xml:space="preserve"> for team of 12 as part SAFe for CAN and Ethernet ECUs for GM’s SDV Platform.</w:t>
+        <w:t>Supported Sienna Smart and Body system Total Quality Checks to root-cause and fix production issues.</w:t>
       </w:r>
     </w:p>
     <w:p>
@@ -788,62 +731,297 @@
         <w:rPr/>
       </w:pPr>
       <w:r>
-        <w:rPr>
-          <w:rStyle w:val="StrongEmphasis"/>
-          <w:rFonts w:eastAsia="Arial" w:cs="Arial" w:ascii="Calibri" w:hAnsi="Calibri"/>
-          <w:b w:val="false"/>
-          <w:bCs w:val="false"/>
-          <w:color w:val="auto"/>
-          <w:sz w:val="22"/>
-          <w:szCs w:val="22"/>
-          <w:lang w:val="en-US" w:eastAsia="en-US" w:bidi="ar-SA"/>
-        </w:rPr>
-        <w:t>•</w:t>
-      </w:r>
-      <w:r>
-        <w:rPr>
-          <w:rStyle w:val="StrongEmphasis"/>
-          <w:rFonts w:eastAsia="Arial" w:cs="Arial" w:ascii="Calibri" w:hAnsi="Calibri"/>
-          <w:b w:val="false"/>
-          <w:bCs w:val="false"/>
-          <w:color w:val="000000"/>
+        <w:rPr/>
+      </w:r>
+    </w:p>
+    <w:p>
+      <w:pPr>
+        <w:pStyle w:val="Normal"/>
+        <w:rPr>
+          <w:color w:val="auto"/>
+        </w:rPr>
+      </w:pPr>
+      <w:r>
+        <w:rPr>
+          <w:rFonts w:eastAsia="Arial" w:cs="Arial" w:ascii="Calibri" w:hAnsi="Calibri"/>
+          <w:b/>
+          <w:bCs/>
+          <w:color w:val="auto"/>
           <w:spacing w:val="0"/>
           <w:kern w:val="0"/>
           <w:sz w:val="22"/>
           <w:szCs w:val="22"/>
-          <w:shd w:fill="auto" w:val="clear"/>
-          <w:lang w:val="en-US" w:eastAsia="en-US" w:bidi="ar-SA"/>
-        </w:rPr>
-        <w:t xml:space="preserve"> </w:t>
-      </w:r>
-      <w:r>
-        <w:rPr>
-          <w:rStyle w:val="StrongEmphasis"/>
-          <w:rFonts w:eastAsia="Arial" w:cs="Arial" w:ascii="Calibri" w:hAnsi="Calibri"/>
-          <w:b w:val="false"/>
-          <w:bCs w:val="false"/>
-          <w:color w:val="000000"/>
+          <w:lang w:val="en-US" w:eastAsia="en-US" w:bidi="ar-SA"/>
+        </w:rPr>
+        <w:t>General Motors</w:t>
+      </w:r>
+      <w:r>
+        <w:rPr>
+          <w:rFonts w:ascii="Calibri" w:hAnsi="Calibri"/>
+          <w:b/>
+          <w:bCs/>
+          <w:color w:val="auto"/>
+          <w:sz w:val="22"/>
+          <w:szCs w:val="22"/>
+        </w:rPr>
+        <w:t xml:space="preserve">, </w:t>
+      </w:r>
+      <w:r>
+        <w:rPr>
+          <w:rFonts w:eastAsia="Arial" w:cs="Arial" w:ascii="Calibri" w:hAnsi="Calibri"/>
+          <w:b w:val="false"/>
+          <w:bCs w:val="false"/>
+          <w:color w:val="auto"/>
           <w:spacing w:val="0"/>
           <w:kern w:val="0"/>
           <w:sz w:val="22"/>
           <w:szCs w:val="22"/>
-          <w:shd w:fill="auto" w:val="clear"/>
-          <w:lang w:val="en-US" w:eastAsia="en-US" w:bidi="ar-SA"/>
-        </w:rPr>
-        <w:t>Developed strategy to benchmark virtualization solutions serving as the basis for tool-chain decisions worth $100k</w:t>
-      </w:r>
-      <w:r>
-        <w:rPr>
-          <w:rStyle w:val="StrongEmphasis"/>
-          <w:rFonts w:eastAsia="Arial" w:cs="Arial" w:ascii="Calibri" w:hAnsi="Calibri"/>
-          <w:b w:val="false"/>
-          <w:bCs w:val="false"/>
-          <w:color w:val="auto"/>
-          <w:sz w:val="22"/>
-          <w:szCs w:val="22"/>
-          <w:lang w:val="en-US" w:eastAsia="en-US" w:bidi="ar-SA"/>
-        </w:rPr>
-        <w:t>+ .</w:t>
+          <w:lang w:val="en-US" w:eastAsia="en-US" w:bidi="ar-SA"/>
+        </w:rPr>
+        <w:t>Warren</w:t>
+      </w:r>
+      <w:r>
+        <w:rPr>
+          <w:rFonts w:ascii="Calibri" w:hAnsi="Calibri"/>
+          <w:b w:val="false"/>
+          <w:bCs w:val="false"/>
+          <w:color w:val="auto"/>
+          <w:sz w:val="22"/>
+          <w:szCs w:val="22"/>
+        </w:rPr>
+        <w:t xml:space="preserve">, </w:t>
+      </w:r>
+      <w:r>
+        <w:rPr>
+          <w:rFonts w:ascii="Calibri" w:hAnsi="Calibri"/>
+          <w:color w:val="auto"/>
+          <w:sz w:val="22"/>
+          <w:szCs w:val="22"/>
+        </w:rPr>
+        <w:t>MI</w:t>
+      </w:r>
+    </w:p>
+    <w:p>
+      <w:pPr>
+        <w:pStyle w:val="Normal"/>
+        <w:rPr>
+          <w:color w:val="auto"/>
+        </w:rPr>
+      </w:pPr>
+      <w:r>
+        <w:rPr>
+          <w:rFonts w:eastAsia="Arial" w:cs="Arial" w:ascii="Calibri" w:hAnsi="Calibri"/>
+          <w:b w:val="false"/>
+          <w:bCs w:val="false"/>
+          <w:i w:val="false"/>
+          <w:iCs w:val="false"/>
+          <w:color w:val="000000"/>
+          <w:spacing w:val="0"/>
+          <w:kern w:val="0"/>
+          <w:sz w:val="22"/>
+          <w:szCs w:val="22"/>
+          <w:u w:val="single"/>
+          <w:shd w:fill="auto" w:val="clear"/>
+          <w:lang w:val="en-US" w:eastAsia="en-US" w:bidi="ar-SA"/>
+        </w:rPr>
+        <w:t xml:space="preserve">Senior </w:t>
+      </w:r>
+      <w:r>
+        <w:rPr>
+          <w:rFonts w:eastAsia="Arial" w:cs="Arial" w:ascii="Calibri" w:hAnsi="Calibri"/>
+          <w:b w:val="false"/>
+          <w:bCs w:val="false"/>
+          <w:i w:val="false"/>
+          <w:iCs w:val="false"/>
+          <w:color w:val="000000"/>
+          <w:spacing w:val="0"/>
+          <w:kern w:val="0"/>
+          <w:sz w:val="22"/>
+          <w:szCs w:val="22"/>
+          <w:u w:val="single"/>
+          <w:shd w:fill="auto" w:val="clear"/>
+          <w:lang w:val="en-US" w:eastAsia="en-US" w:bidi="ar-SA"/>
+        </w:rPr>
+        <w:t>Virtual HIL Engineer</w:t>
+      </w:r>
+      <w:r>
+        <w:rPr>
+          <w:rFonts w:eastAsia="Arial" w:cs="Arial" w:ascii="Calibri" w:hAnsi="Calibri"/>
+          <w:b w:val="false"/>
+          <w:bCs w:val="false"/>
+          <w:i w:val="false"/>
+          <w:iCs w:val="false"/>
+          <w:color w:val="000000"/>
+          <w:spacing w:val="0"/>
+          <w:kern w:val="0"/>
+          <w:sz w:val="22"/>
+          <w:szCs w:val="22"/>
+          <w:shd w:fill="auto" w:val="clear"/>
+          <w:lang w:val="en-US" w:eastAsia="en-US" w:bidi="ar-SA"/>
+        </w:rPr>
+        <w:t xml:space="preserve">  </w:t>
+      </w:r>
+      <w:r>
+        <w:rPr>
+          <w:rFonts w:eastAsia="Arial" w:cs="Arial" w:ascii="Calibri" w:hAnsi="Calibri"/>
+          <w:b/>
+          <w:bCs/>
+          <w:i/>
+          <w:iCs/>
+          <w:color w:val="000000"/>
+          <w:spacing w:val="0"/>
+          <w:kern w:val="0"/>
+          <w:sz w:val="22"/>
+          <w:szCs w:val="22"/>
+          <w:shd w:fill="auto" w:val="clear"/>
+          <w:lang w:val="en-US" w:eastAsia="en-US" w:bidi="ar-SA"/>
+        </w:rPr>
+        <w:t xml:space="preserve">    </w:t>
+      </w:r>
+      <w:r>
+        <w:rPr>
+          <w:rFonts w:eastAsia="Arial" w:cs="Arial" w:ascii="Calibri" w:hAnsi="Calibri"/>
+          <w:b/>
+          <w:bCs/>
+          <w:i/>
+          <w:iCs/>
+          <w:color w:val="auto"/>
+          <w:spacing w:val="0"/>
+          <w:kern w:val="0"/>
+          <w:sz w:val="22"/>
+          <w:szCs w:val="22"/>
+          <w:lang w:val="en-US" w:eastAsia="en-US" w:bidi="ar-SA"/>
+        </w:rPr>
+        <w:t xml:space="preserve">         </w:t>
+        <w:tab/>
+        <w:t xml:space="preserve">                           </w:t>
+        <w:tab/>
+        <w:tab/>
+        <w:tab/>
+        <w:tab/>
+        <w:tab/>
+        <w:t xml:space="preserve">                          </w:t>
+      </w:r>
+      <w:r>
+        <w:rPr>
+          <w:rFonts w:eastAsia="Arial" w:cs="Arial" w:ascii="Calibri" w:hAnsi="Calibri"/>
+          <w:b w:val="false"/>
+          <w:bCs w:val="false"/>
+          <w:i w:val="false"/>
+          <w:iCs w:val="false"/>
+          <w:color w:val="auto"/>
+          <w:spacing w:val="0"/>
+          <w:kern w:val="0"/>
+          <w:sz w:val="22"/>
+          <w:szCs w:val="22"/>
+          <w:lang w:val="en-US" w:eastAsia="en-US" w:bidi="ar-SA"/>
+        </w:rPr>
+        <w:t>Mar</w:t>
+      </w:r>
+      <w:r>
+        <w:rPr>
+          <w:rFonts w:eastAsia="Arial" w:cs="Arial" w:ascii="Calibri" w:hAnsi="Calibri"/>
+          <w:b/>
+          <w:bCs/>
+          <w:i/>
+          <w:iCs/>
+          <w:color w:val="auto"/>
+          <w:spacing w:val="0"/>
+          <w:kern w:val="0"/>
+          <w:sz w:val="22"/>
+          <w:szCs w:val="22"/>
+          <w:lang w:val="en-US" w:eastAsia="en-US" w:bidi="ar-SA"/>
+        </w:rPr>
+        <w:t xml:space="preserve"> </w:t>
+      </w:r>
+      <w:r>
+        <w:rPr>
+          <w:rFonts w:ascii="Calibri" w:hAnsi="Calibri"/>
+          <w:color w:val="auto"/>
+          <w:sz w:val="22"/>
+          <w:szCs w:val="22"/>
+        </w:rPr>
+        <w:t>2021 – Sept 2024</w:t>
+      </w:r>
+      <w:r>
+        <w:rPr>
+          <w:rFonts w:ascii="Calibri" w:hAnsi="Calibri"/>
+          <w:color w:val="000000"/>
+          <w:sz w:val="22"/>
+          <w:szCs w:val="22"/>
+          <w:shd w:fill="auto" w:val="clear"/>
+        </w:rPr>
+        <w:t xml:space="preserve">  </w:t>
+      </w:r>
+    </w:p>
+    <w:p>
+      <w:pPr>
+        <w:pStyle w:val="Normal"/>
+        <w:rPr>
+          <w:color w:val="auto"/>
+        </w:rPr>
+      </w:pPr>
+      <w:r>
+        <w:rPr>
+          <w:rFonts w:ascii="Calibri" w:hAnsi="Calibri"/>
+          <w:color w:val="000000"/>
+          <w:sz w:val="22"/>
+          <w:szCs w:val="22"/>
+          <w:shd w:fill="auto" w:val="clear"/>
+        </w:rPr>
+        <w:t>Utilized</w:t>
+      </w:r>
+      <w:r>
+        <w:rPr>
+          <w:rFonts w:ascii="Calibri" w:hAnsi="Calibri"/>
+          <w:color w:val="auto"/>
+          <w:sz w:val="22"/>
+          <w:szCs w:val="22"/>
+        </w:rPr>
+        <w:t xml:space="preserve"> hardware virtualization to accelerate delivery of software for Software-Defined Vehicle platform.</w:t>
+      </w:r>
+    </w:p>
+    <w:p>
+      <w:pPr>
+        <w:pStyle w:val="Normal"/>
+        <w:tabs>
+          <w:tab w:val="clear" w:pos="708"/>
+        </w:tabs>
+        <w:spacing w:before="0" w:after="0"/>
+        <w:ind w:hanging="0" w:left="0" w:right="0"/>
+        <w:rPr>
+          <w:color w:val="auto"/>
+        </w:rPr>
+      </w:pPr>
+      <w:r>
+        <w:rPr>
+          <w:rFonts w:eastAsia="Arial" w:cs="Arial" w:ascii="Calibri" w:hAnsi="Calibri"/>
+          <w:b w:val="false"/>
+          <w:bCs w:val="false"/>
+          <w:color w:val="000000"/>
+          <w:spacing w:val="0"/>
+          <w:kern w:val="0"/>
+          <w:sz w:val="22"/>
+          <w:szCs w:val="22"/>
+          <w:shd w:fill="auto" w:val="clear"/>
+          <w:lang w:val="en-US" w:eastAsia="en-US" w:bidi="ar-SA"/>
+        </w:rPr>
+        <w:t xml:space="preserve">• </w:t>
+      </w:r>
+      <w:r>
+        <w:rPr>
+          <w:rFonts w:eastAsia="Arial" w:cs="Arial" w:ascii="Calibri" w:hAnsi="Calibri"/>
+          <w:b w:val="false"/>
+          <w:bCs w:val="false"/>
+          <w:color w:val="000000"/>
+          <w:spacing w:val="0"/>
+          <w:kern w:val="0"/>
+          <w:sz w:val="22"/>
+          <w:szCs w:val="22"/>
+          <w:shd w:fill="auto" w:val="clear"/>
+          <w:lang w:val="en-US" w:eastAsia="en-US" w:bidi="ar-SA"/>
+        </w:rPr>
+        <w:t>Championed and secured organizational buy-in for $2 million Synopsys Virtualizer based 'shift-left' approach to Connectivity Module development enabling exploratory early designs.</w:t>
       </w:r>
     </w:p>
     <w:p>
@@ -863,9 +1041,12 @@
           <w:rFonts w:eastAsia="Arial" w:cs="Arial" w:ascii="Calibri" w:hAnsi="Calibri"/>
           <w:b w:val="false"/>
           <w:bCs w:val="false"/>
-          <w:color w:val="auto"/>
-          <w:sz w:val="22"/>
-          <w:szCs w:val="22"/>
+          <w:color w:val="000000"/>
+          <w:spacing w:val="0"/>
+          <w:kern w:val="0"/>
+          <w:sz w:val="22"/>
+          <w:szCs w:val="22"/>
+          <w:shd w:fill="auto" w:val="clear"/>
           <w:lang w:val="en-US" w:eastAsia="en-US" w:bidi="ar-SA"/>
         </w:rPr>
         <w:t xml:space="preserve">• </w:t>
@@ -876,12 +1057,15 @@
           <w:rFonts w:eastAsia="Arial" w:cs="Arial" w:ascii="Calibri" w:hAnsi="Calibri"/>
           <w:b w:val="false"/>
           <w:bCs w:val="false"/>
-          <w:color w:val="auto"/>
-          <w:sz w:val="22"/>
-          <w:szCs w:val="22"/>
-          <w:lang w:val="en-US" w:eastAsia="en-US" w:bidi="ar-SA"/>
-        </w:rPr>
-        <w:t>Utilized Vehicle Spy, CANoe, and WireShark to log and troubleshoot ECUs.</w:t>
+          <w:color w:val="000000"/>
+          <w:spacing w:val="0"/>
+          <w:kern w:val="0"/>
+          <w:sz w:val="22"/>
+          <w:szCs w:val="22"/>
+          <w:shd w:fill="auto" w:val="clear"/>
+          <w:lang w:val="en-US" w:eastAsia="en-US" w:bidi="ar-SA"/>
+        </w:rPr>
+        <w:t xml:space="preserve">Led cross-functional development and delivery of Synopsys Virtualizer based Occupant Safety Module with test software, accelerating integration testing efforts by 4 months ahead of official software availability. </w:t>
       </w:r>
     </w:p>
     <w:p>
@@ -893,84 +1077,229 @@
         <w:spacing w:before="0" w:after="0"/>
         <w:ind w:hanging="0" w:left="0" w:right="0"/>
         <w:jc w:val="left"/>
-        <w:rPr>
-          <w:rStyle w:val="StrongEmphasis"/>
-          <w:rFonts w:ascii="Calibri" w:hAnsi="Calibri" w:eastAsia="Arial" w:cs="Arial"/>
-          <w:b w:val="false"/>
-          <w:bCs w:val="false"/>
-          <w:color w:val="auto"/>
-          <w:sz w:val="22"/>
-          <w:szCs w:val="22"/>
-          <w:lang w:val="en-US" w:eastAsia="en-US" w:bidi="ar-SA"/>
-        </w:rPr>
-      </w:pPr>
-      <w:r>
-        <w:rPr>
-          <w:rFonts w:eastAsia="Arial" w:cs="Arial" w:ascii="Calibri" w:hAnsi="Calibri"/>
-          <w:b w:val="false"/>
-          <w:bCs w:val="false"/>
-          <w:color w:val="auto"/>
-          <w:sz w:val="22"/>
-          <w:szCs w:val="22"/>
-          <w:lang w:val="en-US" w:eastAsia="en-US" w:bidi="ar-SA"/>
-        </w:rPr>
-      </w:r>
-    </w:p>
-    <w:p>
-      <w:pPr>
-        <w:pStyle w:val="Normal"/>
-        <w:rPr>
-          <w:color w:val="auto"/>
-        </w:rPr>
-      </w:pPr>
-      <w:r>
-        <w:rPr>
-          <w:rFonts w:ascii="Calibri" w:hAnsi="Calibri"/>
-          <w:color w:val="auto"/>
-          <w:sz w:val="22"/>
-          <w:szCs w:val="22"/>
-          <w:u w:val="single"/>
-        </w:rPr>
-        <w:t>Senior Connectivity Development Engineer</w:t>
-      </w:r>
-      <w:r>
-        <w:rPr>
-          <w:color w:val="auto"/>
-        </w:rPr>
-        <w:tab/>
-        <w:tab/>
-        <w:tab/>
-        <w:tab/>
-        <w:tab/>
-        <w:tab/>
-      </w:r>
-      <w:r>
-        <w:rPr>
-          <w:rFonts w:ascii="Calibri" w:hAnsi="Calibri"/>
-          <w:color w:val="auto"/>
-          <w:sz w:val="22"/>
-          <w:szCs w:val="22"/>
-        </w:rPr>
-        <w:t xml:space="preserve">       </w:t>
-        <w:tab/>
-        <w:t xml:space="preserve">             Mar 2021 – Nov 2022</w:t>
-      </w:r>
-    </w:p>
-    <w:p>
-      <w:pPr>
-        <w:pStyle w:val="Normal"/>
-        <w:rPr>
-          <w:color w:val="auto"/>
-        </w:rPr>
-      </w:pPr>
-      <w:r>
-        <w:rPr>
-          <w:rFonts w:ascii="Calibri" w:hAnsi="Calibri"/>
-          <w:color w:val="auto"/>
-          <w:sz w:val="22"/>
-          <w:szCs w:val="22"/>
-        </w:rPr>
-        <w:t>Developed features for legacy PHEV and EV OnStar customers and next generation Telematics modules.</w:t>
+        <w:rPr/>
+      </w:pPr>
+      <w:r>
+        <w:rPr>
+          <w:rStyle w:val="StrongEmphasis"/>
+          <w:rFonts w:eastAsia="Arial" w:cs="Arial" w:ascii="Calibri" w:hAnsi="Calibri"/>
+          <w:b w:val="false"/>
+          <w:bCs w:val="false"/>
+          <w:color w:val="000000"/>
+          <w:spacing w:val="0"/>
+          <w:kern w:val="0"/>
+          <w:sz w:val="22"/>
+          <w:szCs w:val="22"/>
+          <w:shd w:fill="auto" w:val="clear"/>
+          <w:lang w:val="en-US" w:eastAsia="en-US" w:bidi="ar-SA"/>
+        </w:rPr>
+        <w:t xml:space="preserve">• </w:t>
+      </w:r>
+      <w:r>
+        <w:rPr>
+          <w:rStyle w:val="StrongEmphasis"/>
+          <w:rFonts w:eastAsia="Arial" w:cs="Arial" w:ascii="Calibri" w:hAnsi="Calibri"/>
+          <w:b w:val="false"/>
+          <w:bCs w:val="false"/>
+          <w:color w:val="000000"/>
+          <w:spacing w:val="0"/>
+          <w:kern w:val="0"/>
+          <w:sz w:val="22"/>
+          <w:szCs w:val="22"/>
+          <w:shd w:fill="auto" w:val="clear"/>
+          <w:lang w:val="en-US" w:eastAsia="en-US" w:bidi="ar-SA"/>
+        </w:rPr>
+        <w:t>Successfully delivered a virtual model of the next-generation Central Gateway Module, enabling exploratory testing 8 months ahead of hardware delivery. This accelerated the concept-to-release timeline and facilitated early software integration and testing.</w:t>
+      </w:r>
+    </w:p>
+    <w:p>
+      <w:pPr>
+        <w:pStyle w:val="Normal"/>
+        <w:tabs>
+          <w:tab w:val="clear" w:pos="708"/>
+        </w:tabs>
+        <w:spacing w:before="0" w:after="0"/>
+        <w:ind w:hanging="0" w:left="0" w:right="0"/>
+        <w:jc w:val="left"/>
+        <w:rPr/>
+      </w:pPr>
+      <w:r>
+        <w:rPr>
+          <w:rStyle w:val="StrongEmphasis"/>
+          <w:rFonts w:eastAsia="Arial" w:cs="Arial" w:ascii="Calibri" w:hAnsi="Calibri"/>
+          <w:b w:val="false"/>
+          <w:bCs w:val="false"/>
+          <w:color w:val="auto"/>
+          <w:sz w:val="22"/>
+          <w:szCs w:val="22"/>
+          <w:lang w:val="en-US" w:eastAsia="en-US" w:bidi="ar-SA"/>
+        </w:rPr>
+        <w:t xml:space="preserve">• </w:t>
+      </w:r>
+      <w:r>
+        <w:rPr>
+          <w:rStyle w:val="StrongEmphasis"/>
+          <w:rFonts w:eastAsia="Arial" w:cs="Arial" w:ascii="Calibri" w:hAnsi="Calibri"/>
+          <w:b w:val="false"/>
+          <w:bCs w:val="false"/>
+          <w:color w:val="auto"/>
+          <w:sz w:val="22"/>
+          <w:szCs w:val="22"/>
+          <w:lang w:val="en-US" w:eastAsia="en-US" w:bidi="ar-SA"/>
+        </w:rPr>
+        <w:t>Integrated a virtual hardware team into the enterprise-level agile framework by leveraging expertise in virtual workflows and collaborating with product owners and release train engineers.</w:t>
+      </w:r>
+    </w:p>
+    <w:p>
+      <w:pPr>
+        <w:pStyle w:val="Normal"/>
+        <w:tabs>
+          <w:tab w:val="clear" w:pos="708"/>
+        </w:tabs>
+        <w:spacing w:before="0" w:after="0"/>
+        <w:ind w:hanging="0" w:left="0" w:right="0"/>
+        <w:jc w:val="left"/>
+        <w:rPr/>
+      </w:pPr>
+      <w:r>
+        <w:rPr>
+          <w:rStyle w:val="StrongEmphasis"/>
+          <w:rFonts w:eastAsia="Arial" w:cs="Arial" w:ascii="Calibri" w:hAnsi="Calibri"/>
+          <w:b w:val="false"/>
+          <w:bCs w:val="false"/>
+          <w:color w:val="auto"/>
+          <w:sz w:val="22"/>
+          <w:szCs w:val="22"/>
+          <w:lang w:val="en-US" w:eastAsia="en-US" w:bidi="ar-SA"/>
+        </w:rPr>
+        <w:t>•</w:t>
+      </w:r>
+      <w:r>
+        <w:rPr>
+          <w:rStyle w:val="StrongEmphasis"/>
+          <w:rFonts w:eastAsia="Arial" w:cs="Arial" w:ascii="Calibri" w:hAnsi="Calibri"/>
+          <w:b w:val="false"/>
+          <w:bCs w:val="false"/>
+          <w:color w:val="000000"/>
+          <w:spacing w:val="0"/>
+          <w:kern w:val="0"/>
+          <w:sz w:val="22"/>
+          <w:szCs w:val="22"/>
+          <w:shd w:fill="auto" w:val="clear"/>
+          <w:lang w:val="en-US" w:eastAsia="en-US" w:bidi="ar-SA"/>
+        </w:rPr>
+        <w:t xml:space="preserve"> </w:t>
+      </w:r>
+      <w:r>
+        <w:rPr>
+          <w:rStyle w:val="StrongEmphasis"/>
+          <w:rFonts w:eastAsia="Arial" w:cs="Arial" w:ascii="Calibri" w:hAnsi="Calibri"/>
+          <w:b w:val="false"/>
+          <w:bCs w:val="false"/>
+          <w:color w:val="000000"/>
+          <w:spacing w:val="0"/>
+          <w:kern w:val="0"/>
+          <w:sz w:val="22"/>
+          <w:szCs w:val="22"/>
+          <w:shd w:fill="auto" w:val="clear"/>
+          <w:lang w:val="en-US" w:eastAsia="en-US" w:bidi="ar-SA"/>
+        </w:rPr>
+        <w:t>Served as Scrum Lead for a 12-member team within a SAFe (Scaled Agile Framework) environment, focusing on CAN and Ethernet ECUs for GM’s Software-Defined Vehicle (SDV) Platform.</w:t>
+      </w:r>
+    </w:p>
+    <w:p>
+      <w:pPr>
+        <w:pStyle w:val="Normal"/>
+        <w:tabs>
+          <w:tab w:val="clear" w:pos="708"/>
+        </w:tabs>
+        <w:spacing w:before="0" w:after="0"/>
+        <w:ind w:hanging="0" w:left="0" w:right="0"/>
+        <w:jc w:val="left"/>
+        <w:rPr/>
+      </w:pPr>
+      <w:r>
+        <w:rPr>
+          <w:rStyle w:val="StrongEmphasis"/>
+          <w:rFonts w:eastAsia="Arial" w:cs="Arial" w:ascii="Calibri" w:hAnsi="Calibri"/>
+          <w:b w:val="false"/>
+          <w:bCs w:val="false"/>
+          <w:color w:val="auto"/>
+          <w:sz w:val="22"/>
+          <w:szCs w:val="22"/>
+          <w:lang w:val="en-US" w:eastAsia="en-US" w:bidi="ar-SA"/>
+        </w:rPr>
+        <w:t>•</w:t>
+      </w:r>
+      <w:r>
+        <w:rPr>
+          <w:rStyle w:val="StrongEmphasis"/>
+          <w:rFonts w:eastAsia="Arial" w:cs="Arial" w:ascii="Calibri" w:hAnsi="Calibri"/>
+          <w:b w:val="false"/>
+          <w:bCs w:val="false"/>
+          <w:color w:val="000000"/>
+          <w:spacing w:val="0"/>
+          <w:kern w:val="0"/>
+          <w:sz w:val="22"/>
+          <w:szCs w:val="22"/>
+          <w:shd w:fill="auto" w:val="clear"/>
+          <w:lang w:val="en-US" w:eastAsia="en-US" w:bidi="ar-SA"/>
+        </w:rPr>
+        <w:t xml:space="preserve"> </w:t>
+      </w:r>
+      <w:r>
+        <w:rPr>
+          <w:rStyle w:val="StrongEmphasis"/>
+          <w:rFonts w:eastAsia="Arial" w:cs="Arial" w:ascii="Calibri" w:hAnsi="Calibri"/>
+          <w:b w:val="false"/>
+          <w:bCs w:val="false"/>
+          <w:color w:val="000000"/>
+          <w:spacing w:val="0"/>
+          <w:kern w:val="0"/>
+          <w:sz w:val="22"/>
+          <w:szCs w:val="22"/>
+          <w:shd w:fill="auto" w:val="clear"/>
+          <w:lang w:val="en-US" w:eastAsia="en-US" w:bidi="ar-SA"/>
+        </w:rPr>
+        <w:t>Developed a comprehensive strategy to benchmark virtualization solutions, which served as the basis for tool-chain decisions valued at over $100k.</w:t>
+      </w:r>
+    </w:p>
+    <w:p>
+      <w:pPr>
+        <w:pStyle w:val="Normal"/>
+        <w:ind w:hanging="0" w:left="0" w:right="0"/>
+        <w:rPr/>
+      </w:pPr>
+      <w:r>
+        <w:rPr>
+          <w:rStyle w:val="StrongEmphasis"/>
+          <w:rFonts w:eastAsia="Arial" w:cs="Arial" w:ascii="Calibri" w:hAnsi="Calibri"/>
+          <w:b w:val="false"/>
+          <w:bCs w:val="false"/>
+          <w:color w:val="auto"/>
+          <w:sz w:val="22"/>
+          <w:szCs w:val="22"/>
+          <w:lang w:val="en-US" w:eastAsia="en-US" w:bidi="ar-SA"/>
+        </w:rPr>
+        <w:t>•</w:t>
+      </w:r>
+      <w:r>
+        <w:rPr>
+          <w:rFonts w:ascii="Calibri" w:hAnsi="Calibri"/>
+          <w:color w:val="auto"/>
+          <w:sz w:val="22"/>
+          <w:szCs w:val="22"/>
+        </w:rPr>
+        <w:t xml:space="preserve"> </w:t>
+      </w:r>
+      <w:r>
+        <w:rPr>
+          <w:rFonts w:ascii="Calibri" w:hAnsi="Calibri"/>
+          <w:color w:val="auto"/>
+          <w:sz w:val="22"/>
+          <w:szCs w:val="22"/>
+        </w:rPr>
+        <w:t>Led multidisciplinary requirements development meetings for OTA features representing $10s of millions in business value.</w:t>
       </w:r>
     </w:p>
     <w:p>
@@ -1016,19 +1345,132 @@
           <w:szCs w:val="22"/>
           <w:shd w:fill="auto" w:val="clear"/>
         </w:rPr>
-        <w:t>Spearheaded sourcing of Connectivity Module serving as the cornerstone</w:t>
-      </w:r>
-      <w:r>
-        <w:rPr>
-          <w:rStyle w:val="StrongEmphasis"/>
-          <w:rFonts w:eastAsia="Calibri" w:cs="Calibri" w:ascii="Calibri" w:hAnsi="Calibri"/>
-          <w:b w:val="false"/>
-          <w:bCs w:val="false"/>
-          <w:color w:val="auto"/>
-          <w:sz w:val="22"/>
-          <w:szCs w:val="22"/>
-        </w:rPr>
-        <w:t xml:space="preserve"> for the Software-Defined Vehicle platform by leading a cross-functional team to select best supplier based on internal metrics.</w:t>
+        <w:t>Developed and executed a mitigation plan with senior leaders to address the 2G/3G sunset, safeguarding tens of millions in revenue and critical safety features for hundreds of thousands of OnStar customers.</w:t>
+      </w:r>
+    </w:p>
+    <w:p>
+      <w:pPr>
+        <w:pStyle w:val="LO-normal"/>
+        <w:ind w:hanging="0" w:left="0" w:right="0"/>
+        <w:rPr>
+          <w:b/>
+          <w:bCs/>
+          <w:color w:val="auto"/>
+        </w:rPr>
+      </w:pPr>
+      <w:r>
+        <w:rPr>
+          <w:b/>
+          <w:bCs/>
+          <w:color w:val="auto"/>
+        </w:rPr>
+      </w:r>
+    </w:p>
+    <w:p>
+      <w:pPr>
+        <w:pStyle w:val="Normal"/>
+        <w:rPr>
+          <w:color w:val="auto"/>
+        </w:rPr>
+      </w:pPr>
+      <w:r>
+        <w:rPr>
+          <w:rFonts w:ascii="Calibri" w:hAnsi="Calibri"/>
+          <w:b/>
+          <w:bCs/>
+          <w:color w:val="auto"/>
+          <w:sz w:val="22"/>
+          <w:szCs w:val="22"/>
+        </w:rPr>
+        <w:t xml:space="preserve">Aerotek (Contract at General Motors), </w:t>
+      </w:r>
+      <w:r>
+        <w:rPr>
+          <w:rFonts w:ascii="Calibri" w:hAnsi="Calibri"/>
+          <w:color w:val="auto"/>
+          <w:sz w:val="22"/>
+          <w:szCs w:val="22"/>
+        </w:rPr>
+        <w:t>Warren, MI</w:t>
+      </w:r>
+    </w:p>
+    <w:p>
+      <w:pPr>
+        <w:pStyle w:val="Normal"/>
+        <w:rPr>
+          <w:color w:val="auto"/>
+        </w:rPr>
+      </w:pPr>
+      <w:r>
+        <w:rPr>
+          <w:rFonts w:ascii="Calibri" w:hAnsi="Calibri"/>
+          <w:color w:val="auto"/>
+          <w:sz w:val="22"/>
+          <w:szCs w:val="22"/>
+          <w:u w:val="single"/>
+        </w:rPr>
+        <w:t>Telematics System Integration Engineer</w:t>
+      </w:r>
+      <w:r>
+        <w:rPr>
+          <w:rFonts w:ascii="Calibri" w:hAnsi="Calibri"/>
+          <w:color w:val="auto"/>
+          <w:sz w:val="22"/>
+          <w:szCs w:val="22"/>
+          <w:u w:val="none"/>
+        </w:rPr>
+        <w:t xml:space="preserve"> </w:t>
+      </w:r>
+      <w:r>
+        <w:rPr>
+          <w:color w:val="auto"/>
+        </w:rPr>
+        <w:tab/>
+        <w:tab/>
+        <w:tab/>
+        <w:tab/>
+        <w:tab/>
+        <w:tab/>
+        <w:tab/>
+        <w:t xml:space="preserve">           </w:t>
+      </w:r>
+      <w:r>
+        <w:rPr>
+          <w:rFonts w:ascii="Calibri" w:hAnsi="Calibri"/>
+          <w:color w:val="auto"/>
+          <w:sz w:val="22"/>
+          <w:szCs w:val="22"/>
+          <w:u w:val="none"/>
+        </w:rPr>
+        <w:t>Sep 2</w:t>
+      </w:r>
+      <w:r>
+        <w:rPr>
+          <w:rFonts w:ascii="Calibri" w:hAnsi="Calibri"/>
+          <w:color w:val="auto"/>
+          <w:sz w:val="22"/>
+          <w:szCs w:val="22"/>
+        </w:rPr>
+        <w:t>020 – Mar 2021</w:t>
+      </w:r>
+    </w:p>
+    <w:p>
+      <w:pPr>
+        <w:pStyle w:val="Normal"/>
+        <w:rPr>
+          <w:color w:val="auto"/>
+        </w:rPr>
+      </w:pPr>
+      <w:r>
+        <w:rPr>
+          <w:rFonts w:ascii="Calibri" w:hAnsi="Calibri"/>
+          <w:b w:val="false"/>
+          <w:bCs w:val="false"/>
+          <w:color w:val="auto"/>
+          <w:sz w:val="22"/>
+          <w:szCs w:val="22"/>
+        </w:rPr>
+        <w:t>Vehicle Side CAN Integration lead for OnStar 2G/3G Sunset Adapter project for 100k + active legacy customers.</w:t>
       </w:r>
     </w:p>
     <w:p>
@@ -1053,6 +1495,8 @@
       <w:r>
         <w:rPr>
           <w:rFonts w:ascii="Calibri" w:hAnsi="Calibri"/>
+          <w:b w:val="false"/>
+          <w:bCs w:val="false"/>
           <w:color w:val="auto"/>
           <w:sz w:val="22"/>
           <w:szCs w:val="22"/>
@@ -1062,11 +1506,13 @@
       <w:r>
         <w:rPr>
           <w:rFonts w:ascii="Calibri" w:hAnsi="Calibri"/>
-          <w:color w:val="auto"/>
-          <w:sz w:val="22"/>
-          <w:szCs w:val="22"/>
-        </w:rPr>
-        <w:t>Led multidisciplinary requirements development meetings for features representing $10s of millions in business value.</w:t>
+          <w:b w:val="false"/>
+          <w:bCs w:val="false"/>
+          <w:color w:val="auto"/>
+          <w:sz w:val="22"/>
+          <w:szCs w:val="22"/>
+        </w:rPr>
+        <w:t xml:space="preserve">Led cross-functional workshops between subject matter experts and suppliers to ensure project requirements were met. </w:t>
       </w:r>
     </w:p>
     <w:p>
@@ -1090,7 +1536,10 @@
       </w:r>
       <w:r>
         <w:rPr>
-          <w:rFonts w:ascii="Calibri" w:hAnsi="Calibri"/>
+          <w:rStyle w:val="StrongEmphasis"/>
+          <w:rFonts w:ascii="Calibri" w:hAnsi="Calibri"/>
+          <w:b w:val="false"/>
+          <w:bCs w:val="false"/>
           <w:color w:val="000000"/>
           <w:sz w:val="22"/>
           <w:szCs w:val="22"/>
@@ -1100,18 +1549,21 @@
       </w:r>
       <w:r>
         <w:rPr>
-          <w:rFonts w:ascii="Calibri" w:hAnsi="Calibri"/>
-          <w:color w:val="000000"/>
-          <w:sz w:val="22"/>
-          <w:szCs w:val="22"/>
-          <w:shd w:fill="auto" w:val="clear"/>
-        </w:rPr>
-        <w:t>Leveraged agile principles to preempt resolve issues while keeping leadership apprised for quick updates in strategy.</w:t>
-      </w:r>
-    </w:p>
-    <w:p>
-      <w:pPr>
-        <w:pStyle w:val="LO-normal"/>
+          <w:rStyle w:val="StrongEmphasis"/>
+          <w:rFonts w:ascii="Calibri" w:hAnsi="Calibri"/>
+          <w:b w:val="false"/>
+          <w:bCs w:val="false"/>
+          <w:color w:val="000000"/>
+          <w:sz w:val="22"/>
+          <w:szCs w:val="22"/>
+          <w:shd w:fill="auto" w:val="clear"/>
+        </w:rPr>
+        <w:t>Proactively tackled development and implementation challenges in test setups and provided direction for creating electrical testing harnesses while mentoring junior engineers.</w:t>
+      </w:r>
+    </w:p>
+    <w:p>
+      <w:pPr>
+        <w:pStyle w:val="Normal"/>
         <w:ind w:hanging="0" w:left="0" w:right="0"/>
         <w:rPr/>
       </w:pPr>
@@ -1130,33 +1582,54 @@
       </w:r>
       <w:r>
         <w:rPr>
-          <w:rStyle w:val="StrongEmphasis"/>
-          <w:rFonts w:eastAsia="Calibri" w:cs="Calibri" w:ascii="Calibri" w:hAnsi="Calibri"/>
-          <w:b w:val="false"/>
-          <w:bCs w:val="false"/>
-          <w:color w:val="000000"/>
-          <w:sz w:val="22"/>
-          <w:szCs w:val="22"/>
-          <w:shd w:fill="auto" w:val="clear"/>
+          <w:rFonts w:ascii="Calibri" w:hAnsi="Calibri"/>
+          <w:b w:val="false"/>
+          <w:bCs w:val="false"/>
+          <w:color w:val="auto"/>
+          <w:sz w:val="22"/>
+          <w:szCs w:val="22"/>
         </w:rPr>
         <w:t xml:space="preserve"> </w:t>
       </w:r>
       <w:r>
         <w:rPr>
-          <w:rStyle w:val="StrongEmphasis"/>
-          <w:rFonts w:eastAsia="Calibri" w:cs="Calibri" w:ascii="Calibri" w:hAnsi="Calibri"/>
-          <w:b w:val="false"/>
-          <w:bCs w:val="false"/>
-          <w:color w:val="auto"/>
-          <w:sz w:val="22"/>
-          <w:szCs w:val="22"/>
-        </w:rPr>
-        <w:t>Helped safeguard $10s of millions in revenue and critical safety features for hundreds of thousands of OnStar customers impacted by the 2G/3G sunset by developing a mitigation plan with senior leaders.</w:t>
-      </w:r>
-    </w:p>
-    <w:p>
-      <w:pPr>
-        <w:pStyle w:val="LO-normal"/>
+          <w:rFonts w:ascii="Calibri" w:hAnsi="Calibri"/>
+          <w:b w:val="false"/>
+          <w:bCs w:val="false"/>
+          <w:color w:val="auto"/>
+          <w:sz w:val="22"/>
+          <w:szCs w:val="22"/>
+        </w:rPr>
+        <w:t xml:space="preserve">Engaged system architects, subject experts, and suppliers to work on OTA related change requests for existing telematics modules to spearhead GM’s evolving OTA strategy. </w:t>
+      </w:r>
+    </w:p>
+    <w:p>
+      <w:pPr>
+        <w:pStyle w:val="Normal"/>
+        <w:ind w:hanging="0" w:left="0" w:right="0"/>
+        <w:rPr>
+          <w:rFonts w:ascii="Calibri" w:hAnsi="Calibri"/>
+          <w:b w:val="false"/>
+          <w:bCs w:val="false"/>
+          <w:color w:val="auto"/>
+          <w:sz w:val="22"/>
+          <w:szCs w:val="22"/>
+        </w:rPr>
+      </w:pPr>
+      <w:r>
+        <w:rPr>
+          <w:rFonts w:ascii="Calibri" w:hAnsi="Calibri"/>
+          <w:b w:val="false"/>
+          <w:bCs w:val="false"/>
+          <w:color w:val="auto"/>
+          <w:sz w:val="22"/>
+          <w:szCs w:val="22"/>
+        </w:rPr>
+      </w:r>
+    </w:p>
+    <w:p>
+      <w:pPr>
+        <w:pStyle w:val="Normal"/>
         <w:ind w:hanging="0" w:left="0" w:right="0"/>
         <w:rPr>
           <w:b/>
@@ -1188,16 +1661,16 @@
           <w:sz w:val="22"/>
           <w:szCs w:val="22"/>
         </w:rPr>
-        <w:t xml:space="preserve">Aerotek (Contract at General Motors), </w:t>
-      </w:r>
-      <w:r>
-        <w:rPr>
-          <w:rFonts w:ascii="Calibri" w:hAnsi="Calibri"/>
-          <w:color w:val="auto"/>
-          <w:sz w:val="22"/>
-          <w:szCs w:val="22"/>
-        </w:rPr>
-        <w:t>Warren, MI</w:t>
+        <w:t xml:space="preserve">FAW US Research and Development, </w:t>
+      </w:r>
+      <w:r>
+        <w:rPr>
+          <w:rFonts w:ascii="Calibri" w:hAnsi="Calibri"/>
+          <w:color w:val="auto"/>
+          <w:sz w:val="22"/>
+          <w:szCs w:val="22"/>
+        </w:rPr>
+        <w:t>Plymouth, MI</w:t>
       </w:r>
     </w:p>
     <w:p>
@@ -1215,15 +1688,14 @@
           <w:szCs w:val="22"/>
           <w:u w:val="single"/>
         </w:rPr>
-        <w:t>Telematics System Integration Engineer</w:t>
-      </w:r>
-      <w:r>
-        <w:rPr>
-          <w:rFonts w:ascii="Calibri" w:hAnsi="Calibri"/>
-          <w:color w:val="auto"/>
-          <w:sz w:val="22"/>
-          <w:szCs w:val="22"/>
-          <w:u w:val="none"/>
+        <w:t>Autonomous Vehicle Controls Engineer</w:t>
+      </w:r>
+      <w:r>
+        <w:rPr>
+          <w:rFonts w:ascii="Calibri" w:hAnsi="Calibri"/>
+          <w:color w:val="auto"/>
+          <w:sz w:val="22"/>
+          <w:szCs w:val="22"/>
         </w:rPr>
         <w:t xml:space="preserve"> </w:t>
       </w:r>
@@ -1237,46 +1709,34 @@
         <w:tab/>
         <w:tab/>
         <w:tab/>
-        <w:tab/>
-        <w:t xml:space="preserve">           </w:t>
-      </w:r>
-      <w:r>
-        <w:rPr>
-          <w:rFonts w:ascii="Calibri" w:hAnsi="Calibri"/>
-          <w:color w:val="auto"/>
-          <w:sz w:val="22"/>
-          <w:szCs w:val="22"/>
-          <w:u w:val="none"/>
-        </w:rPr>
-        <w:t>Sep 2</w:t>
-      </w:r>
-      <w:r>
-        <w:rPr>
-          <w:rFonts w:ascii="Calibri" w:hAnsi="Calibri"/>
-          <w:color w:val="auto"/>
-          <w:sz w:val="22"/>
-          <w:szCs w:val="22"/>
-        </w:rPr>
-        <w:t>020 – Mar 2021</w:t>
-      </w:r>
-    </w:p>
-    <w:p>
-      <w:pPr>
-        <w:pStyle w:val="Normal"/>
-        <w:rPr>
-          <w:color w:val="auto"/>
-        </w:rPr>
-      </w:pPr>
-      <w:r>
-        <w:rPr>
-          <w:rFonts w:ascii="Calibri" w:hAnsi="Calibri"/>
-          <w:b w:val="false"/>
-          <w:bCs w:val="false"/>
-          <w:color w:val="auto"/>
-          <w:sz w:val="22"/>
-          <w:szCs w:val="22"/>
-        </w:rPr>
-        <w:t>Vehicle Side CAN Integration lead for OnStar 2G/3G Sunset Adapter project for 100k + active legacy customers.</w:t>
+      </w:r>
+      <w:r>
+        <w:rPr>
+          <w:rFonts w:ascii="Calibri" w:hAnsi="Calibri"/>
+          <w:color w:val="auto"/>
+          <w:sz w:val="22"/>
+          <w:szCs w:val="22"/>
+        </w:rPr>
+        <w:t xml:space="preserve">                            Feb 2020 – Aug 2020</w:t>
+      </w:r>
+    </w:p>
+    <w:p>
+      <w:pPr>
+        <w:pStyle w:val="Normal"/>
+        <w:rPr>
+          <w:color w:val="auto"/>
+        </w:rPr>
+      </w:pPr>
+      <w:r>
+        <w:rPr>
+          <w:rFonts w:ascii="Calibri" w:hAnsi="Calibri"/>
+          <w:b w:val="false"/>
+          <w:bCs w:val="false"/>
+          <w:color w:val="auto"/>
+          <w:sz w:val="22"/>
+          <w:szCs w:val="22"/>
+        </w:rPr>
+        <w:t>Part of a team of controls engineers, systems engineers, and integration engineers for L4 AV Planning and Control.</w:t>
       </w:r>
     </w:p>
     <w:p>
@@ -1318,7 +1778,7 @@
           <w:sz w:val="22"/>
           <w:szCs w:val="22"/>
         </w:rPr>
-        <w:t xml:space="preserve">Led cross-functional workshops between subject matter experts and suppliers to ensure project requirements were met. </w:t>
+        <w:t>Researched Vehicle Dynamics models and methods of Lateral Control for vehicles under typical highway scenarios in MATLAB/Simulink for ADAS and autonomy.</w:t>
       </w:r>
     </w:p>
     <w:p>
@@ -1342,7 +1802,6 @@
       </w:r>
       <w:r>
         <w:rPr>
-          <w:rStyle w:val="StrongEmphasis"/>
           <w:rFonts w:ascii="Calibri" w:hAnsi="Calibri"/>
           <w:b w:val="false"/>
           <w:bCs w:val="false"/>
@@ -1355,16 +1814,14 @@
       </w:r>
       <w:r>
         <w:rPr>
-          <w:rStyle w:val="StrongEmphasis"/>
-          <w:rFonts w:ascii="Calibri" w:hAnsi="Calibri"/>
-          <w:b w:val="false"/>
-          <w:bCs w:val="false"/>
-          <w:color w:val="000000"/>
-          <w:sz w:val="22"/>
-          <w:szCs w:val="22"/>
-          <w:shd w:fill="auto" w:val="clear"/>
-        </w:rPr>
-        <w:t>Proactively tackled development and implementation challenges in test setups and provided direction for creating electrical testing harnesses while mentoring junior engineers.</w:t>
+          <w:rFonts w:ascii="Calibri" w:hAnsi="Calibri"/>
+          <w:b w:val="false"/>
+          <w:bCs w:val="false"/>
+          <w:color w:val="auto"/>
+          <w:sz w:val="22"/>
+          <w:szCs w:val="22"/>
+        </w:rPr>
+        <w:t>Independently developed and executed test plans for PID based longitudinal and LQR based lateral control algorithms using MATLAB, allowing team to catch and resolve issues before integration.</w:t>
       </w:r>
     </w:p>
     <w:p>
@@ -1406,120 +1863,7 @@
           <w:sz w:val="22"/>
           <w:szCs w:val="22"/>
         </w:rPr>
-        <w:t xml:space="preserve">Engaged system architects, subject experts, and suppliers to work on OTA related change requests for existing telematics modules to spearhead GM’s evolving OTA strategy. </w:t>
-      </w:r>
-    </w:p>
-    <w:p>
-      <w:pPr>
-        <w:pStyle w:val="Normal"/>
-        <w:rPr>
-          <w:b/>
-          <w:bCs/>
-          <w:color w:val="auto"/>
-        </w:rPr>
-      </w:pPr>
-      <w:r>
-        <w:rPr>
-          <w:b/>
-          <w:bCs/>
-          <w:color w:val="auto"/>
-        </w:rPr>
-      </w:r>
-    </w:p>
-    <w:p>
-      <w:pPr>
-        <w:pStyle w:val="Normal"/>
-        <w:rPr>
-          <w:color w:val="auto"/>
-        </w:rPr>
-      </w:pPr>
-      <w:r>
-        <w:rPr>
-          <w:rFonts w:ascii="Calibri" w:hAnsi="Calibri"/>
-          <w:b/>
-          <w:bCs/>
-          <w:color w:val="auto"/>
-          <w:sz w:val="22"/>
-          <w:szCs w:val="22"/>
-        </w:rPr>
-        <w:t xml:space="preserve">FAW US Research and Development, </w:t>
-      </w:r>
-      <w:r>
-        <w:rPr>
-          <w:rFonts w:ascii="Calibri" w:hAnsi="Calibri"/>
-          <w:color w:val="auto"/>
-          <w:sz w:val="22"/>
-          <w:szCs w:val="22"/>
-        </w:rPr>
-        <w:t>Plymouth, MI</w:t>
-      </w:r>
-    </w:p>
-    <w:p>
-      <w:pPr>
-        <w:pStyle w:val="Normal"/>
-        <w:rPr>
-          <w:color w:val="auto"/>
-        </w:rPr>
-      </w:pPr>
-      <w:r>
-        <w:rPr>
-          <w:rFonts w:ascii="Calibri" w:hAnsi="Calibri"/>
-          <w:color w:val="auto"/>
-          <w:sz w:val="22"/>
-          <w:szCs w:val="22"/>
-          <w:u w:val="single"/>
-        </w:rPr>
-        <w:t>Autonomous Vehicle Controls Engineer</w:t>
-      </w:r>
-      <w:r>
-        <w:rPr>
-          <w:rFonts w:ascii="Calibri" w:hAnsi="Calibri"/>
-          <w:color w:val="auto"/>
-          <w:sz w:val="22"/>
-          <w:szCs w:val="22"/>
-        </w:rPr>
-        <w:t xml:space="preserve"> </w:t>
-      </w:r>
-      <w:r>
-        <w:rPr>
-          <w:color w:val="auto"/>
-        </w:rPr>
-        <w:tab/>
-        <w:tab/>
-        <w:tab/>
-        <w:tab/>
-        <w:tab/>
-        <w:tab/>
-      </w:r>
-      <w:r>
-        <w:rPr>
-          <w:rFonts w:ascii="Calibri" w:hAnsi="Calibri"/>
-          <w:color w:val="auto"/>
-          <w:sz w:val="22"/>
-          <w:szCs w:val="22"/>
-        </w:rPr>
-        <w:t xml:space="preserve">                    </w:t>
-        <w:tab/>
-        <w:t>Feb 2020 – Aug 2020</w:t>
-      </w:r>
-    </w:p>
-    <w:p>
-      <w:pPr>
-        <w:pStyle w:val="Normal"/>
-        <w:rPr>
-          <w:color w:val="auto"/>
-        </w:rPr>
-      </w:pPr>
-      <w:r>
-        <w:rPr>
-          <w:rFonts w:ascii="Calibri" w:hAnsi="Calibri"/>
-          <w:b w:val="false"/>
-          <w:bCs w:val="false"/>
-          <w:color w:val="auto"/>
-          <w:sz w:val="22"/>
-          <w:szCs w:val="22"/>
-        </w:rPr>
-        <w:t>Part of a team of controls engineers, systems engineers, and integration engineers for L4 AV Planning and Control.</w:t>
+        <w:t>Worked closely with integration team to integrate and debug Software Releases in CarMaker SIL environment.</w:t>
       </w:r>
     </w:p>
     <w:p>
@@ -1561,182 +1905,7 @@
           <w:sz w:val="22"/>
           <w:szCs w:val="22"/>
         </w:rPr>
-        <w:t>Researched Vehicle Dynamics models and methods of Lateral Control for vehicles under typical highway scenarios in MATLAB/Simulink for ADAS and autonomy.</w:t>
-      </w:r>
-    </w:p>
-    <w:p>
-      <w:pPr>
-        <w:pStyle w:val="Normal"/>
-        <w:ind w:hanging="0" w:left="0" w:right="0"/>
-        <w:rPr/>
-      </w:pPr>
-      <w:r>
-        <w:rPr>
-          <w:rStyle w:val="StrongEmphasis"/>
-          <w:rFonts w:eastAsia="Arial" w:cs="Arial" w:ascii="Calibri" w:hAnsi="Calibri"/>
-          <w:b w:val="false"/>
-          <w:bCs w:val="false"/>
-          <w:color w:val="auto"/>
-          <w:sz w:val="22"/>
-          <w:szCs w:val="22"/>
-          <w:lang w:val="en-US" w:eastAsia="en-US" w:bidi="ar-SA"/>
-        </w:rPr>
-        <w:t>•</w:t>
-      </w:r>
-      <w:r>
-        <w:rPr>
-          <w:rFonts w:ascii="Calibri" w:hAnsi="Calibri"/>
-          <w:b w:val="false"/>
-          <w:bCs w:val="false"/>
-          <w:color w:val="000000"/>
-          <w:sz w:val="22"/>
-          <w:szCs w:val="22"/>
-          <w:shd w:fill="auto" w:val="clear"/>
-        </w:rPr>
-        <w:t xml:space="preserve"> </w:t>
-      </w:r>
-      <w:r>
-        <w:rPr>
-          <w:rFonts w:ascii="Calibri" w:hAnsi="Calibri"/>
-          <w:b w:val="false"/>
-          <w:bCs w:val="false"/>
-          <w:color w:val="auto"/>
-          <w:sz w:val="22"/>
-          <w:szCs w:val="22"/>
-        </w:rPr>
-        <w:t>Independently developed and executed test plans for PID based longitudinal and LQR based lateral control algorithms using MATLAB, allowing team to catch and resolve issues before integration.</w:t>
-      </w:r>
-    </w:p>
-    <w:p>
-      <w:pPr>
-        <w:pStyle w:val="Normal"/>
-        <w:ind w:hanging="0" w:left="0" w:right="0"/>
-        <w:rPr/>
-      </w:pPr>
-      <w:r>
-        <w:rPr>
-          <w:rStyle w:val="StrongEmphasis"/>
-          <w:rFonts w:eastAsia="Arial" w:cs="Arial" w:ascii="Calibri" w:hAnsi="Calibri"/>
-          <w:b w:val="false"/>
-          <w:bCs w:val="false"/>
-          <w:color w:val="auto"/>
-          <w:sz w:val="22"/>
-          <w:szCs w:val="22"/>
-          <w:lang w:val="en-US" w:eastAsia="en-US" w:bidi="ar-SA"/>
-        </w:rPr>
-        <w:t>•</w:t>
-      </w:r>
-      <w:r>
-        <w:rPr>
-          <w:rFonts w:ascii="Calibri" w:hAnsi="Calibri"/>
-          <w:b w:val="false"/>
-          <w:bCs w:val="false"/>
-          <w:color w:val="auto"/>
-          <w:sz w:val="22"/>
-          <w:szCs w:val="22"/>
-        </w:rPr>
-        <w:t xml:space="preserve"> </w:t>
-      </w:r>
-      <w:r>
-        <w:rPr>
-          <w:rFonts w:ascii="Calibri" w:hAnsi="Calibri"/>
-          <w:b w:val="false"/>
-          <w:bCs w:val="false"/>
-          <w:color w:val="auto"/>
-          <w:sz w:val="22"/>
-          <w:szCs w:val="22"/>
-        </w:rPr>
-        <w:t>Worked closely with integration team to integrate and debug Software Releases in CarMaker SIL environment.</w:t>
-      </w:r>
-    </w:p>
-    <w:p>
-      <w:pPr>
-        <w:pStyle w:val="Normal"/>
-        <w:ind w:hanging="0" w:left="0" w:right="0"/>
-        <w:rPr/>
-      </w:pPr>
-      <w:r>
-        <w:rPr>
-          <w:rStyle w:val="StrongEmphasis"/>
-          <w:rFonts w:eastAsia="Arial" w:cs="Arial" w:ascii="Calibri" w:hAnsi="Calibri"/>
-          <w:b w:val="false"/>
-          <w:bCs w:val="false"/>
-          <w:color w:val="auto"/>
-          <w:sz w:val="22"/>
-          <w:szCs w:val="22"/>
-          <w:lang w:val="en-US" w:eastAsia="en-US" w:bidi="ar-SA"/>
-        </w:rPr>
-        <w:t>•</w:t>
-      </w:r>
-      <w:r>
-        <w:rPr>
-          <w:rFonts w:ascii="Calibri" w:hAnsi="Calibri"/>
-          <w:b w:val="false"/>
-          <w:bCs w:val="false"/>
-          <w:color w:val="auto"/>
-          <w:sz w:val="22"/>
-          <w:szCs w:val="22"/>
-        </w:rPr>
-        <w:t xml:space="preserve"> </w:t>
-      </w:r>
-      <w:r>
-        <w:rPr>
-          <w:rFonts w:ascii="Calibri" w:hAnsi="Calibri"/>
-          <w:b w:val="false"/>
-          <w:bCs w:val="false"/>
-          <w:color w:val="auto"/>
-          <w:sz w:val="22"/>
-          <w:szCs w:val="22"/>
-        </w:rPr>
         <w:t>Developed Object Oriented MATLAB scripts to analyze an visualize CAN data from MobilEye EyeQ4 system.</w:t>
-      </w:r>
-    </w:p>
-    <w:p>
-      <w:pPr>
-        <w:pStyle w:val="Normal"/>
-        <w:ind w:hanging="0" w:left="0" w:right="0"/>
-        <w:rPr>
-          <w:rFonts w:ascii="Calibri" w:hAnsi="Calibri"/>
-          <w:b w:val="false"/>
-          <w:bCs w:val="false"/>
-          <w:color w:val="auto"/>
-          <w:sz w:val="22"/>
-          <w:szCs w:val="22"/>
-        </w:rPr>
-      </w:pPr>
-      <w:r>
-        <w:rPr>
-          <w:rFonts w:ascii="Calibri" w:hAnsi="Calibri"/>
-          <w:b w:val="false"/>
-          <w:bCs w:val="false"/>
-          <w:color w:val="auto"/>
-          <w:sz w:val="22"/>
-          <w:szCs w:val="22"/>
-        </w:rPr>
-      </w:r>
-    </w:p>
-    <w:p>
-      <w:pPr>
-        <w:pStyle w:val="Normal"/>
-        <w:ind w:hanging="0" w:left="0" w:right="0"/>
-        <w:rPr>
-          <w:rFonts w:ascii="Calibri" w:hAnsi="Calibri"/>
-          <w:b w:val="false"/>
-          <w:bCs w:val="false"/>
-          <w:color w:val="auto"/>
-          <w:sz w:val="22"/>
-          <w:szCs w:val="22"/>
-        </w:rPr>
-      </w:pPr>
-      <w:r>
-        <w:rPr>
-          <w:rFonts w:ascii="Calibri" w:hAnsi="Calibri"/>
-          <w:b w:val="false"/>
-          <w:bCs w:val="false"/>
-          <w:color w:val="auto"/>
-          <w:sz w:val="22"/>
-          <w:szCs w:val="22"/>
-        </w:rPr>
       </w:r>
     </w:p>
     <w:p>
@@ -2650,370 +2819,6 @@
           <w:szCs w:val="22"/>
           <w:shd w:fill="auto" w:val="clear"/>
         </w:rPr>
-      </w:r>
-    </w:p>
-    <w:p>
-      <w:pPr>
-        <w:pStyle w:val="Normal"/>
-        <w:rPr/>
-      </w:pPr>
-      <w:r>
-        <w:rPr>
-          <w:rFonts w:ascii="Calibri" w:hAnsi="Calibri"/>
-          <w:b/>
-          <w:bCs/>
-          <w:color w:val="000000"/>
-          <w:sz w:val="22"/>
-          <w:szCs w:val="22"/>
-          <w:shd w:fill="auto" w:val="clear"/>
-        </w:rPr>
-        <w:t>Fraunhofer USA,</w:t>
-      </w:r>
-      <w:r>
-        <w:rPr>
-          <w:rFonts w:ascii="Calibri" w:hAnsi="Calibri"/>
-          <w:b w:val="false"/>
-          <w:bCs w:val="false"/>
-          <w:color w:val="000000"/>
-          <w:sz w:val="22"/>
-          <w:szCs w:val="22"/>
-          <w:shd w:fill="auto" w:val="clear"/>
-        </w:rPr>
-        <w:t xml:space="preserve"> Plymouth, MI</w:t>
-      </w:r>
-    </w:p>
-    <w:p>
-      <w:pPr>
-        <w:pStyle w:val="Normal"/>
-        <w:rPr>
-          <w:u w:val="single"/>
-        </w:rPr>
-      </w:pPr>
-      <w:r>
-        <w:rPr>
-          <w:rFonts w:ascii="Calibri" w:hAnsi="Calibri"/>
-          <w:b w:val="false"/>
-          <w:bCs w:val="false"/>
-          <w:color w:val="000000"/>
-          <w:sz w:val="22"/>
-          <w:szCs w:val="22"/>
-          <w:u w:val="single"/>
-          <w:shd w:fill="auto" w:val="clear"/>
-        </w:rPr>
-        <w:t>Intern</w:t>
-      </w:r>
-      <w:r>
-        <w:rPr>
-          <w:rFonts w:ascii="Calibri" w:hAnsi="Calibri"/>
-          <w:b w:val="false"/>
-          <w:bCs w:val="false"/>
-          <w:color w:val="000000"/>
-          <w:sz w:val="22"/>
-          <w:szCs w:val="22"/>
-          <w:u w:val="none"/>
-          <w:shd w:fill="auto" w:val="clear"/>
-        </w:rPr>
-        <w:tab/>
-        <w:tab/>
-        <w:tab/>
-        <w:tab/>
-        <w:tab/>
-        <w:tab/>
-        <w:tab/>
-        <w:tab/>
-        <w:tab/>
-        <w:tab/>
-        <w:tab/>
-        <w:t xml:space="preserve">                    </w:t>
-        <w:tab/>
-        <w:t>Oct 2011 – Mar 2012</w:t>
-      </w:r>
-    </w:p>
-    <w:p>
-      <w:pPr>
-        <w:pStyle w:val="Normal"/>
-        <w:rPr/>
-      </w:pPr>
-      <w:r>
-        <w:rPr>
-          <w:rStyle w:val="StrongEmphasis"/>
-          <w:rFonts w:eastAsia="Arial" w:cs="Arial" w:ascii="Calibri" w:hAnsi="Calibri"/>
-          <w:b w:val="false"/>
-          <w:bCs w:val="false"/>
-          <w:color w:val="000000"/>
-          <w:sz w:val="22"/>
-          <w:szCs w:val="22"/>
-          <w:shd w:fill="auto" w:val="clear"/>
-          <w:lang w:val="en-US" w:eastAsia="en-US" w:bidi="ar-SA"/>
-        </w:rPr>
-        <w:t>•</w:t>
-      </w:r>
-      <w:r>
-        <w:rPr>
-          <w:rFonts w:ascii="Calibri" w:hAnsi="Calibri"/>
-          <w:b w:val="false"/>
-          <w:bCs w:val="false"/>
-          <w:color w:val="000000"/>
-          <w:sz w:val="22"/>
-          <w:szCs w:val="22"/>
-          <w:shd w:fill="auto" w:val="clear"/>
-        </w:rPr>
-        <w:t xml:space="preserve"> </w:t>
-      </w:r>
-      <w:r>
-        <w:rPr>
-          <w:rFonts w:ascii="Calibri" w:hAnsi="Calibri"/>
-          <w:b w:val="false"/>
-          <w:bCs w:val="false"/>
-          <w:color w:val="000000"/>
-          <w:sz w:val="22"/>
-          <w:szCs w:val="22"/>
-          <w:shd w:fill="auto" w:val="clear"/>
-        </w:rPr>
-        <w:t>Validated and aligned high-power Diode Laser systems.</w:t>
-      </w:r>
-    </w:p>
-    <w:p>
-      <w:pPr>
-        <w:pStyle w:val="Normal"/>
-        <w:rPr/>
-      </w:pPr>
-      <w:r>
-        <w:rPr>
-          <w:rStyle w:val="StrongEmphasis"/>
-          <w:rFonts w:eastAsia="Arial" w:cs="Arial" w:ascii="Calibri" w:hAnsi="Calibri"/>
-          <w:b w:val="false"/>
-          <w:bCs w:val="false"/>
-          <w:color w:val="000000"/>
-          <w:sz w:val="22"/>
-          <w:szCs w:val="22"/>
-          <w:shd w:fill="auto" w:val="clear"/>
-          <w:lang w:val="en-US" w:eastAsia="en-US" w:bidi="ar-SA"/>
-        </w:rPr>
-        <w:t>•</w:t>
-      </w:r>
-      <w:r>
-        <w:rPr>
-          <w:rFonts w:ascii="Calibri" w:hAnsi="Calibri"/>
-          <w:b w:val="false"/>
-          <w:bCs w:val="false"/>
-          <w:color w:val="000000"/>
-          <w:sz w:val="22"/>
-          <w:szCs w:val="22"/>
-          <w:shd w:fill="auto" w:val="clear"/>
-        </w:rPr>
-        <w:t xml:space="preserve"> </w:t>
-      </w:r>
-      <w:r>
-        <w:rPr>
-          <w:rFonts w:ascii="Calibri" w:hAnsi="Calibri"/>
-          <w:b w:val="false"/>
-          <w:bCs w:val="false"/>
-          <w:color w:val="000000"/>
-          <w:sz w:val="22"/>
-          <w:szCs w:val="22"/>
-          <w:shd w:fill="auto" w:val="clear"/>
-        </w:rPr>
-        <w:t>Supported run-off production assisting engineers in assembly and fixture design.</w:t>
-      </w:r>
-    </w:p>
-    <w:p>
-      <w:pPr>
-        <w:pStyle w:val="Normal"/>
-        <w:rPr>
-          <w:rFonts w:ascii="Calibri" w:hAnsi="Calibri"/>
-          <w:b w:val="false"/>
-          <w:bCs w:val="false"/>
-          <w:color w:val="000000"/>
-          <w:sz w:val="22"/>
-          <w:szCs w:val="22"/>
-          <w:shd w:fill="auto" w:val="clear"/>
-        </w:rPr>
-      </w:pPr>
-      <w:r>
-        <w:rPr>
-          <w:rFonts w:ascii="Calibri" w:hAnsi="Calibri"/>
-          <w:b w:val="false"/>
-          <w:bCs w:val="false"/>
-          <w:color w:val="000000"/>
-          <w:sz w:val="22"/>
-          <w:szCs w:val="22"/>
-          <w:shd w:fill="auto" w:val="clear"/>
-        </w:rPr>
-      </w:r>
-    </w:p>
-    <w:p>
-      <w:pPr>
-        <w:pStyle w:val="Normal"/>
-        <w:rPr/>
-      </w:pPr>
-      <w:r>
-        <w:rPr>
-          <w:rFonts w:ascii="Calibri" w:hAnsi="Calibri"/>
-          <w:b/>
-          <w:bCs/>
-          <w:color w:val="000000"/>
-          <w:sz w:val="22"/>
-          <w:szCs w:val="22"/>
-          <w:shd w:fill="auto" w:val="clear"/>
-        </w:rPr>
-        <w:t>Institute of Diagnostic Imaging Research,</w:t>
-      </w:r>
-      <w:r>
-        <w:rPr>
-          <w:rFonts w:ascii="Calibri" w:hAnsi="Calibri"/>
-          <w:b w:val="false"/>
-          <w:bCs w:val="false"/>
-          <w:color w:val="000000"/>
-          <w:sz w:val="22"/>
-          <w:szCs w:val="22"/>
-          <w:shd w:fill="auto" w:val="clear"/>
-        </w:rPr>
-        <w:t xml:space="preserve"> Windsor, ON</w:t>
-      </w:r>
-    </w:p>
-    <w:p>
-      <w:pPr>
-        <w:pStyle w:val="Normal"/>
-        <w:rPr/>
-      </w:pPr>
-      <w:r>
-        <w:rPr>
-          <w:rFonts w:ascii="Calibri" w:hAnsi="Calibri"/>
-          <w:b w:val="false"/>
-          <w:bCs w:val="false"/>
-          <w:color w:val="000000"/>
-          <w:sz w:val="22"/>
-          <w:szCs w:val="22"/>
-          <w:u w:val="single"/>
-          <w:shd w:fill="auto" w:val="clear"/>
-        </w:rPr>
-        <w:t>Summer Intern</w:t>
-      </w:r>
-      <w:r>
-        <w:rPr>
-          <w:rFonts w:ascii="Calibri" w:hAnsi="Calibri"/>
-          <w:b w:val="false"/>
-          <w:bCs w:val="false"/>
-          <w:color w:val="000000"/>
-          <w:sz w:val="22"/>
-          <w:szCs w:val="22"/>
-          <w:u w:val="none"/>
-          <w:shd w:fill="auto" w:val="clear"/>
-        </w:rPr>
-        <w:tab/>
-      </w:r>
-      <w:r>
-        <w:rPr>
-          <w:rFonts w:ascii="Calibri" w:hAnsi="Calibri"/>
-          <w:b w:val="false"/>
-          <w:bCs w:val="false"/>
-          <w:color w:val="000000"/>
-          <w:sz w:val="22"/>
-          <w:szCs w:val="22"/>
-          <w:shd w:fill="auto" w:val="clear"/>
-        </w:rPr>
-        <w:tab/>
-        <w:tab/>
-        <w:tab/>
-        <w:tab/>
-        <w:tab/>
-        <w:tab/>
-        <w:tab/>
-        <w:tab/>
-        <w:tab/>
-        <w:t xml:space="preserve">          </w:t>
-        <w:tab/>
-        <w:tab/>
-        <w:t>Jun 2011 - Oct 2011</w:t>
-      </w:r>
-    </w:p>
-    <w:p>
-      <w:pPr>
-        <w:pStyle w:val="Normal"/>
-        <w:rPr/>
-      </w:pPr>
-      <w:r>
-        <w:rPr>
-          <w:rStyle w:val="StrongEmphasis"/>
-          <w:rFonts w:eastAsia="Arial" w:cs="Arial" w:ascii="Calibri" w:hAnsi="Calibri"/>
-          <w:b w:val="false"/>
-          <w:bCs w:val="false"/>
-          <w:color w:val="000000"/>
-          <w:sz w:val="22"/>
-          <w:szCs w:val="22"/>
-          <w:shd w:fill="auto" w:val="clear"/>
-          <w:lang w:val="en-US" w:eastAsia="en-US" w:bidi="ar-SA"/>
-        </w:rPr>
-        <w:t>•</w:t>
-      </w:r>
-      <w:r>
-        <w:rPr>
-          <w:rFonts w:ascii="Calibri" w:hAnsi="Calibri"/>
-          <w:b w:val="false"/>
-          <w:bCs w:val="false"/>
-          <w:color w:val="000000"/>
-          <w:sz w:val="22"/>
-          <w:szCs w:val="22"/>
-          <w:shd w:fill="auto" w:val="clear"/>
-        </w:rPr>
-        <w:t xml:space="preserve"> </w:t>
-      </w:r>
-      <w:r>
-        <w:rPr>
-          <w:rFonts w:ascii="Calibri" w:hAnsi="Calibri"/>
-          <w:b w:val="false"/>
-          <w:bCs w:val="false"/>
-          <w:color w:val="000000"/>
-          <w:sz w:val="22"/>
-          <w:szCs w:val="22"/>
-          <w:shd w:fill="auto" w:val="clear"/>
-        </w:rPr>
-        <w:t>Utilized MATLAB to analyze for performing root-cause analysis and modeling of Ultrasonic sensor noise.</w:t>
-      </w:r>
-    </w:p>
-    <w:p>
-      <w:pPr>
-        <w:pStyle w:val="Normal"/>
-        <w:rPr/>
-      </w:pPr>
-      <w:r>
-        <w:rPr>
-          <w:rStyle w:val="StrongEmphasis"/>
-          <w:rFonts w:eastAsia="Arial" w:cs="Arial" w:ascii="Calibri" w:hAnsi="Calibri"/>
-          <w:b w:val="false"/>
-          <w:bCs w:val="false"/>
-          <w:color w:val="000000"/>
-          <w:sz w:val="22"/>
-          <w:szCs w:val="22"/>
-          <w:shd w:fill="auto" w:val="clear"/>
-          <w:lang w:val="en-US" w:eastAsia="en-US" w:bidi="ar-SA"/>
-        </w:rPr>
-        <w:t>•</w:t>
-      </w:r>
-      <w:r>
-        <w:rPr>
-          <w:rFonts w:ascii="Calibri" w:hAnsi="Calibri"/>
-          <w:b w:val="false"/>
-          <w:bCs w:val="false"/>
-          <w:color w:val="000000"/>
-          <w:sz w:val="22"/>
-          <w:szCs w:val="22"/>
-          <w:shd w:fill="auto" w:val="clear"/>
-        </w:rPr>
-        <w:t xml:space="preserve"> </w:t>
-      </w:r>
-      <w:r>
-        <w:rPr>
-          <w:rFonts w:ascii="Calibri" w:hAnsi="Calibri"/>
-          <w:b w:val="false"/>
-          <w:bCs w:val="false"/>
-          <w:color w:val="000000"/>
-          <w:sz w:val="22"/>
-          <w:szCs w:val="22"/>
-          <w:shd w:fill="auto" w:val="clear"/>
-        </w:rPr>
-        <w:t>Presented data and conclusions to leadership of the institute at end-of-term.</w:t>
       </w:r>
     </w:p>
     <w:p>
@@ -3276,7 +3081,7 @@
     <w:pPr>
       <w:widowControl/>
       <w:suppressAutoHyphens w:val="true"/>
-      <w:overflowPunct w:val="true"/>
+      <w:overflowPunct w:val="false"/>
       <w:bidi w:val="0"/>
       <w:spacing w:lineRule="auto" w:line="240" w:before="0" w:after="0"/>
       <w:ind w:hanging="0" w:left="0" w:right="0"/>
@@ -3835,7 +3640,7 @@
     <w:pPr>
       <w:widowControl/>
       <w:suppressAutoHyphens w:val="true"/>
-      <w:overflowPunct w:val="true"/>
+      <w:overflowPunct w:val="false"/>
       <w:bidi w:val="0"/>
       <w:spacing w:lineRule="auto" w:line="276" w:before="0" w:after="200"/>
       <w:ind w:hanging="0" w:left="0" w:right="0"/>
@@ -3891,7 +3696,7 @@
     <w:pPr>
       <w:widowControl/>
       <w:suppressAutoHyphens w:val="true"/>
-      <w:overflowPunct w:val="true"/>
+      <w:overflowPunct w:val="false"/>
       <w:bidi w:val="0"/>
       <w:spacing w:lineRule="auto" w:line="240" w:before="0" w:after="0"/>
       <w:ind w:hanging="0" w:left="0" w:right="0"/>

</xml_diff>